<commit_message>
Planned structure of report
</commit_message>
<xml_diff>
--- a/Crime_EDA_Report.docx
+++ b/Crime_EDA_Report.docx
@@ -2,7 +2,1493 @@
 <file path=word/document.xml><?xml version="1.0" encoding="utf-8"?>
 <w:document xmlns:wpc="http://schemas.microsoft.com/office/word/2010/wordprocessingCanvas" xmlns:cx="http://schemas.microsoft.com/office/drawing/2014/chartex" xmlns:cx1="http://schemas.microsoft.com/office/drawing/2015/9/8/chartex" xmlns:cx2="http://schemas.microsoft.com/office/drawing/2015/10/21/chartex" xmlns:cx3="http://schemas.microsoft.com/office/drawing/2016/5/9/chartex" xmlns:cx4="http://schemas.microsoft.com/office/drawing/2016/5/10/chartex" xmlns:cx5="http://schemas.microsoft.com/office/drawing/2016/5/11/chartex" xmlns:cx6="http://schemas.microsoft.com/office/drawing/2016/5/12/chartex" xmlns:cx7="http://schemas.microsoft.com/office/drawing/2016/5/13/chartex" xmlns:cx8="http://schemas.microsoft.com/office/drawing/2016/5/14/chartex" xmlns:mc="http://schemas.openxmlformats.org/markup-compatibility/2006" xmlns:aink="http://schemas.microsoft.com/office/drawing/2016/ink" xmlns:am3d="http://schemas.microsoft.com/office/drawing/2017/model3d" xmlns:o="urn:schemas-microsoft-com:office:office" xmlns:oel="http://schemas.microsoft.com/office/2019/extlst" xmlns:r="http://schemas.openxmlformats.org/officeDocument/2006/relationships" xmlns:m="http://schemas.openxmlformats.org/officeDocument/2006/math" xmlns:v="urn:schemas-microsoft-com:vml" xmlns:wp14="http://schemas.microsoft.com/office/word/2010/wordprocessingDrawing" xmlns:wp="http://schemas.openxmlformats.org/drawingml/2006/wordprocessingDrawing" xmlns:w10="urn:schemas-microsoft-com:office:word" xmlns:w="http://schemas.openxmlformats.org/wordprocessingml/2006/main" xmlns:w14="http://schemas.microsoft.com/office/word/2010/wordml" xmlns:w15="http://schemas.microsoft.com/office/word/2012/wordml" xmlns:w16cex="http://schemas.microsoft.com/office/word/2018/wordml/cex" xmlns:w16cid="http://schemas.microsoft.com/office/word/2016/wordml/cid" xmlns:w16="http://schemas.microsoft.com/office/word/2018/wordml" xmlns:w16du="http://schemas.microsoft.com/office/word/2023/wordml/word16du" xmlns:w16sdtdh="http://schemas.microsoft.com/office/word/2020/wordml/sdtdatahash" xmlns:w16sdtfl="http://schemas.microsoft.com/office/word/2024/wordml/sdtformatlock" xmlns:w16se="http://schemas.microsoft.com/office/word/2015/wordml/symex" xmlns:wpg="http://schemas.microsoft.com/office/word/2010/wordprocessingGroup" xmlns:wpi="http://schemas.microsoft.com/office/word/2010/wordprocessingInk" xmlns:wne="http://schemas.microsoft.com/office/word/2006/wordml" xmlns:wps="http://schemas.microsoft.com/office/word/2010/wordprocessingShape" mc:Ignorable="w14 w15 w16se w16cid w16 w16cex w16sdtdh w16sdtfl w16du wp14">
   <w:body>
+    <w:p>
+      <w:pPr>
+        <w:ind w:left="720" w:hanging="360"/>
+      </w:pPr>
+      <w:r>
+        <w:t xml:space="preserve">Questions to answer </w:t>
+      </w:r>
+    </w:p>
+    <w:p>
+      <w:pPr>
+        <w:pStyle w:val="ListParagraph"/>
+        <w:numPr>
+          <w:ilvl w:val="0"/>
+          <w:numId w:val="2"/>
+        </w:numPr>
+      </w:pPr>
+      <w:r>
+        <w:t>What crimes are the most prevalent in each region?</w:t>
+      </w:r>
+    </w:p>
+    <w:p>
+      <w:pPr>
+        <w:pStyle w:val="ListParagraph"/>
+        <w:numPr>
+          <w:ilvl w:val="0"/>
+          <w:numId w:val="2"/>
+        </w:numPr>
+      </w:pPr>
+      <w:r>
+        <w:t>What is the most common outcome of each crime in by region?</w:t>
+      </w:r>
+    </w:p>
+    <w:p>
+      <w:pPr>
+        <w:pStyle w:val="ListParagraph"/>
+        <w:numPr>
+          <w:ilvl w:val="0"/>
+          <w:numId w:val="2"/>
+        </w:numPr>
+      </w:pPr>
+      <w:r>
+        <w:t xml:space="preserve"> What are the most common areas for crime to take place? </w:t>
+      </w:r>
+    </w:p>
+    <w:p>
+      <w:pPr>
+        <w:pStyle w:val="ListParagraph"/>
+        <w:numPr>
+          <w:ilvl w:val="0"/>
+          <w:numId w:val="2"/>
+        </w:numPr>
+      </w:pPr>
+      <w:r>
+        <w:t>Which regions have the most crimes reported?</w:t>
+      </w:r>
+    </w:p>
+    <w:p>
+      <w:pPr>
+        <w:pStyle w:val="ListParagraph"/>
+        <w:numPr>
+          <w:ilvl w:val="0"/>
+          <w:numId w:val="2"/>
+        </w:numPr>
+      </w:pPr>
+      <w:r>
+        <w:t>How does crime differ between regions in the north and south of the UK?</w:t>
+      </w:r>
+    </w:p>
     <w:p/>
+    <w:p>
+      <w:proofErr w:type="gramStart"/>
+      <w:r>
+        <w:t>Populations :</w:t>
+      </w:r>
+      <w:proofErr w:type="gramEnd"/>
+    </w:p>
+    <w:p>
+      <w:pPr>
+        <w:pStyle w:val="ListParagraph"/>
+        <w:numPr>
+          <w:ilvl w:val="0"/>
+          <w:numId w:val="2"/>
+        </w:numPr>
+        <w:rPr>
+          <w:rStyle w:val="Strong"/>
+          <w:b w:val="0"/>
+          <w:bCs w:val="0"/>
+        </w:rPr>
+      </w:pPr>
+      <w:proofErr w:type="gramStart"/>
+      <w:r>
+        <w:t>Cheshire :</w:t>
+      </w:r>
+      <w:proofErr w:type="gramEnd"/>
+      <w:r>
+        <w:t xml:space="preserve"> </w:t>
+      </w:r>
+      <w:r>
+        <w:t xml:space="preserve"> east cheshire </w:t>
+      </w:r>
+      <w:r>
+        <w:rPr>
+          <w:rFonts w:ascii="Arial" w:hAnsi="Arial" w:cs="Arial"/>
+          <w:color w:val="212529"/>
+          <w:sz w:val="36"/>
+          <w:szCs w:val="36"/>
+          <w:shd w:val="clear" w:color="auto" w:fill="FFFFFF"/>
+        </w:rPr>
+        <w:t>421,300</w:t>
+      </w:r>
+      <w:r>
+        <w:rPr>
+          <w:rFonts w:ascii="Arial" w:hAnsi="Arial" w:cs="Arial"/>
+          <w:color w:val="212529"/>
+          <w:sz w:val="36"/>
+          <w:szCs w:val="36"/>
+          <w:shd w:val="clear" w:color="auto" w:fill="FFFFFF"/>
+        </w:rPr>
+        <w:t xml:space="preserve"> (22/1/25)</w:t>
+      </w:r>
+      <w:r>
+        <w:rPr>
+          <w:rFonts w:ascii="Arial" w:hAnsi="Arial" w:cs="Arial"/>
+          <w:color w:val="212529"/>
+          <w:sz w:val="36"/>
+          <w:szCs w:val="36"/>
+          <w:shd w:val="clear" w:color="auto" w:fill="FFFFFF"/>
+        </w:rPr>
+        <w:t xml:space="preserve"> west </w:t>
+      </w:r>
+      <w:proofErr w:type="spellStart"/>
+      <w:r>
+        <w:rPr>
+          <w:rFonts w:ascii="Arial" w:hAnsi="Arial" w:cs="Arial"/>
+          <w:color w:val="212529"/>
+          <w:sz w:val="36"/>
+          <w:szCs w:val="36"/>
+          <w:shd w:val="clear" w:color="auto" w:fill="FFFFFF"/>
+        </w:rPr>
+        <w:t>chester</w:t>
+      </w:r>
+      <w:proofErr w:type="spellEnd"/>
+      <w:r>
+        <w:rPr>
+          <w:rFonts w:ascii="Arial" w:hAnsi="Arial" w:cs="Arial"/>
+          <w:color w:val="212529"/>
+          <w:sz w:val="36"/>
+          <w:szCs w:val="36"/>
+          <w:shd w:val="clear" w:color="auto" w:fill="FFFFFF"/>
+        </w:rPr>
+        <w:t xml:space="preserve"> and </w:t>
+      </w:r>
+      <w:proofErr w:type="spellStart"/>
+      <w:r>
+        <w:rPr>
+          <w:rFonts w:ascii="Arial" w:hAnsi="Arial" w:cs="Arial"/>
+          <w:color w:val="212529"/>
+          <w:sz w:val="36"/>
+          <w:szCs w:val="36"/>
+          <w:shd w:val="clear" w:color="auto" w:fill="FFFFFF"/>
+        </w:rPr>
+        <w:t>chester</w:t>
+      </w:r>
+      <w:proofErr w:type="spellEnd"/>
+      <w:r>
+        <w:rPr>
+          <w:rFonts w:ascii="Arial" w:hAnsi="Arial" w:cs="Arial"/>
+          <w:color w:val="212529"/>
+          <w:sz w:val="36"/>
+          <w:szCs w:val="36"/>
+          <w:shd w:val="clear" w:color="auto" w:fill="FFFFFF"/>
+        </w:rPr>
+        <w:t xml:space="preserve"> </w:t>
+      </w:r>
+      <w:r>
+        <w:rPr>
+          <w:rFonts w:ascii="Arial" w:hAnsi="Arial" w:cs="Arial"/>
+          <w:color w:val="000000"/>
+        </w:rPr>
+        <w:t>357,200 </w:t>
+      </w:r>
+      <w:proofErr w:type="spellStart"/>
+      <w:r>
+        <w:rPr>
+          <w:rFonts w:ascii="Arial" w:hAnsi="Arial" w:cs="Arial"/>
+          <w:color w:val="000000"/>
+        </w:rPr>
+        <w:t>warrington</w:t>
+      </w:r>
+      <w:proofErr w:type="spellEnd"/>
+      <w:r>
+        <w:rPr>
+          <w:rFonts w:ascii="Arial" w:hAnsi="Arial" w:cs="Arial"/>
+          <w:color w:val="000000"/>
+        </w:rPr>
+        <w:t xml:space="preserve"> </w:t>
+      </w:r>
+      <w:r>
+        <w:rPr>
+          <w:rStyle w:val="Strong"/>
+          <w:rFonts w:ascii="Open Sans" w:hAnsi="Open Sans" w:cs="Open Sans"/>
+          <w:color w:val="212529"/>
+          <w:shd w:val="clear" w:color="auto" w:fill="FFFFFF"/>
+        </w:rPr>
+        <w:t>215,391</w:t>
+      </w:r>
+      <w:r>
+        <w:rPr>
+          <w:rStyle w:val="Strong"/>
+          <w:rFonts w:ascii="Open Sans" w:hAnsi="Open Sans" w:cs="Open Sans"/>
+          <w:color w:val="212529"/>
+          <w:shd w:val="clear" w:color="auto" w:fill="FFFFFF"/>
+        </w:rPr>
+        <w:t xml:space="preserve"> </w:t>
+      </w:r>
+      <w:proofErr w:type="spellStart"/>
+      <w:r>
+        <w:rPr>
+          <w:rStyle w:val="Strong"/>
+          <w:rFonts w:ascii="Open Sans" w:hAnsi="Open Sans" w:cs="Open Sans"/>
+          <w:color w:val="212529"/>
+          <w:shd w:val="clear" w:color="auto" w:fill="FFFFFF"/>
+        </w:rPr>
+        <w:t>halton</w:t>
+      </w:r>
+      <w:proofErr w:type="spellEnd"/>
+      <w:r>
+        <w:rPr>
+          <w:rStyle w:val="Strong"/>
+          <w:rFonts w:ascii="Open Sans" w:hAnsi="Open Sans" w:cs="Open Sans"/>
+          <w:color w:val="212529"/>
+          <w:shd w:val="clear" w:color="auto" w:fill="FFFFFF"/>
+        </w:rPr>
+        <w:t xml:space="preserve"> </w:t>
+      </w:r>
+      <w:r>
+        <w:rPr>
+          <w:rStyle w:val="Strong"/>
+          <w:rFonts w:ascii="Bebas Neue" w:hAnsi="Bebas Neue"/>
+          <w:color w:val="EE0000"/>
+          <w:sz w:val="144"/>
+          <w:szCs w:val="144"/>
+          <w:bdr w:val="none" w:sz="0" w:space="0" w:color="auto" w:frame="1"/>
+        </w:rPr>
+        <w:t>131,543</w:t>
+      </w:r>
+    </w:p>
+    <w:p>
+      <w:pPr>
+        <w:pStyle w:val="ListParagraph"/>
+      </w:pPr>
+    </w:p>
+    <w:p>
+      <w:pPr>
+        <w:pStyle w:val="ListParagraph"/>
+        <w:numPr>
+          <w:ilvl w:val="0"/>
+          <w:numId w:val="2"/>
+        </w:numPr>
+      </w:pPr>
+    </w:p>
+    <w:p>
+      <w:pPr>
+        <w:pStyle w:val="ListParagraph"/>
+      </w:pPr>
+      <w:r>
+        <w:t xml:space="preserve">= </w:t>
+      </w:r>
+      <w:r>
+        <w:t>1125434</w:t>
+      </w:r>
+    </w:p>
+    <w:p>
+      <w:pPr>
+        <w:pStyle w:val="ListParagraph"/>
+        <w:numPr>
+          <w:ilvl w:val="0"/>
+          <w:numId w:val="2"/>
+        </w:numPr>
+      </w:pPr>
+      <w:r>
+        <w:t xml:space="preserve">Kent: </w:t>
+      </w:r>
+      <w:r>
+        <w:rPr>
+          <w:rFonts w:ascii="Helvetica Neue" w:hAnsi="Helvetica Neue"/>
+          <w:color w:val="303955"/>
+          <w:sz w:val="27"/>
+          <w:szCs w:val="27"/>
+        </w:rPr>
+        <w:t>1,639,000</w:t>
+      </w:r>
+      <w:r>
+        <w:rPr>
+          <w:rFonts w:ascii="Helvetica Neue" w:hAnsi="Helvetica Neue"/>
+          <w:color w:val="303955"/>
+          <w:sz w:val="27"/>
+          <w:szCs w:val="27"/>
+        </w:rPr>
+        <w:t xml:space="preserve"> (12/2025)</w:t>
+      </w:r>
+    </w:p>
+    <w:p>
+      <w:pPr>
+        <w:pStyle w:val="ListParagraph"/>
+        <w:numPr>
+          <w:ilvl w:val="0"/>
+          <w:numId w:val="2"/>
+        </w:numPr>
+      </w:pPr>
+      <w:r>
+        <w:t xml:space="preserve">Lincolnshire: </w:t>
+      </w:r>
+      <w:r>
+        <w:rPr>
+          <w:rFonts w:ascii="Menlo" w:hAnsi="Menlo" w:cs="Menlo"/>
+          <w:color w:val="000000"/>
+          <w:sz w:val="27"/>
+          <w:szCs w:val="27"/>
+          <w:shd w:val="clear" w:color="auto" w:fill="EEF2FF"/>
+        </w:rPr>
+        <w:t>769,500</w:t>
+      </w:r>
+      <w:r>
+        <w:rPr>
+          <w:rFonts w:ascii="Menlo" w:hAnsi="Menlo" w:cs="Menlo"/>
+          <w:color w:val="000000"/>
+          <w:sz w:val="27"/>
+          <w:szCs w:val="27"/>
+          <w:shd w:val="clear" w:color="auto" w:fill="EEF2FF"/>
+        </w:rPr>
+        <w:t xml:space="preserve"> (1/</w:t>
+      </w:r>
+      <w:proofErr w:type="gramStart"/>
+      <w:r>
+        <w:rPr>
+          <w:rFonts w:ascii="Menlo" w:hAnsi="Menlo" w:cs="Menlo"/>
+          <w:color w:val="000000"/>
+          <w:sz w:val="27"/>
+          <w:szCs w:val="27"/>
+          <w:shd w:val="clear" w:color="auto" w:fill="EEF2FF"/>
+        </w:rPr>
+        <w:t>2025)(</w:t>
+      </w:r>
+      <w:proofErr w:type="gramEnd"/>
+      <w:r>
+        <w:rPr>
+          <w:rFonts w:ascii="Menlo" w:hAnsi="Menlo" w:cs="Menlo"/>
+          <w:color w:val="000000"/>
+          <w:sz w:val="27"/>
+          <w:szCs w:val="27"/>
+          <w:shd w:val="clear" w:color="auto" w:fill="EEF2FF"/>
+        </w:rPr>
+        <w:t>changes very often)</w:t>
+      </w:r>
+      <w:r>
+        <w:rPr>
+          <w:rFonts w:ascii="Roboto" w:hAnsi="Roboto"/>
+          <w:color w:val="383835"/>
+          <w:sz w:val="26"/>
+          <w:szCs w:val="26"/>
+        </w:rPr>
+        <w:t xml:space="preserve"> </w:t>
+      </w:r>
+      <w:r>
+        <w:rPr>
+          <w:rFonts w:ascii="Roboto" w:hAnsi="Roboto"/>
+          <w:color w:val="383835"/>
+          <w:sz w:val="26"/>
+          <w:szCs w:val="26"/>
+        </w:rPr>
+        <w:t>in 2024 was 789,502, this reflects a growth of 21,138 people (2.75%) since the 2021 Census.</w:t>
+      </w:r>
+    </w:p>
+    <w:p>
+      <w:pPr>
+        <w:pStyle w:val="ListParagraph"/>
+        <w:numPr>
+          <w:ilvl w:val="0"/>
+          <w:numId w:val="2"/>
+        </w:numPr>
+      </w:pPr>
+      <w:r>
+        <w:t xml:space="preserve">Sussex: </w:t>
+      </w:r>
+      <w:r>
+        <w:rPr>
+          <w:rFonts w:ascii="Lato" w:hAnsi="Lato"/>
+          <w:color w:val="1A1A1A"/>
+          <w:shd w:val="clear" w:color="auto" w:fill="FFFFFF"/>
+        </w:rPr>
+        <w:t>East Sussex was estimated to be 560,882 in mid-2024.</w:t>
+      </w:r>
+      <w:r>
+        <w:rPr>
+          <w:rFonts w:ascii="Roboto" w:hAnsi="Roboto"/>
+          <w:color w:val="0F477E"/>
+          <w:sz w:val="27"/>
+          <w:szCs w:val="27"/>
+          <w:shd w:val="clear" w:color="auto" w:fill="F0FFF0"/>
+        </w:rPr>
+        <w:t xml:space="preserve"> </w:t>
+      </w:r>
+      <w:r>
+        <w:rPr>
+          <w:rFonts w:ascii="Roboto" w:hAnsi="Roboto"/>
+          <w:color w:val="0F477E"/>
+          <w:sz w:val="27"/>
+          <w:szCs w:val="27"/>
+          <w:shd w:val="clear" w:color="auto" w:fill="F0FFF0"/>
+        </w:rPr>
+        <w:t>2024, </w:t>
+      </w:r>
+      <w:r>
+        <w:rPr>
+          <w:rStyle w:val="Strong"/>
+          <w:rFonts w:ascii="Roboto" w:hAnsi="Roboto"/>
+          <w:color w:val="0F477E"/>
+          <w:sz w:val="27"/>
+          <w:szCs w:val="27"/>
+          <w:shd w:val="clear" w:color="auto" w:fill="F0FFF0"/>
+        </w:rPr>
+        <w:t>915,037</w:t>
+      </w:r>
+      <w:r>
+        <w:rPr>
+          <w:rFonts w:ascii="Roboto" w:hAnsi="Roboto"/>
+          <w:color w:val="0F477E"/>
+          <w:sz w:val="27"/>
+          <w:szCs w:val="27"/>
+          <w:shd w:val="clear" w:color="auto" w:fill="F0FFF0"/>
+        </w:rPr>
+        <w:t> people were estimated to be resident in West Sussex</w:t>
+      </w:r>
+    </w:p>
+    <w:p>
+      <w:pPr>
+        <w:pStyle w:val="ListParagraph"/>
+        <w:numPr>
+          <w:ilvl w:val="0"/>
+          <w:numId w:val="2"/>
+        </w:numPr>
+      </w:pPr>
+      <w:r>
+        <w:t>283,870</w:t>
+      </w:r>
+      <w:r>
+        <w:t xml:space="preserve"> </w:t>
+      </w:r>
+      <w:r>
+        <w:t>Estimated number of residents in Brighton &amp; Hove (2024)</w:t>
+      </w:r>
+    </w:p>
+    <w:p>
+      <w:pPr>
+        <w:pStyle w:val="ListParagraph"/>
+        <w:numPr>
+          <w:ilvl w:val="0"/>
+          <w:numId w:val="2"/>
+        </w:numPr>
+      </w:pPr>
+      <w:r>
+        <w:t>= 1759789</w:t>
+      </w:r>
+    </w:p>
+    <w:p>
+      <w:pPr>
+        <w:ind w:left="360"/>
+      </w:pPr>
+    </w:p>
+    <w:p>
+      <w:pPr>
+        <w:pStyle w:val="ListParagraph"/>
+        <w:numPr>
+          <w:ilvl w:val="0"/>
+          <w:numId w:val="2"/>
+        </w:numPr>
+      </w:pPr>
+      <w:r>
+        <w:t xml:space="preserve">Dataset has 840644 instances </w:t>
+      </w:r>
+    </w:p>
+    <w:p>
+      <w:pPr>
+        <w:pStyle w:val="ListParagraph"/>
+      </w:pPr>
+    </w:p>
+    <w:p>
+      <w:pPr>
+        <w:pStyle w:val="ListParagraph"/>
+        <w:numPr>
+          <w:ilvl w:val="0"/>
+          <w:numId w:val="2"/>
+        </w:numPr>
+      </w:pPr>
+      <w:r>
+        <w:t xml:space="preserve">Number of instances per region </w:t>
+      </w:r>
+    </w:p>
+    <w:p>
+      <w:pPr>
+        <w:pStyle w:val="ListParagraph"/>
+      </w:pPr>
+    </w:p>
+    <w:p>
+      <w:pPr>
+        <w:pStyle w:val="HTMLPreformatted"/>
+        <w:shd w:val="clear" w:color="auto" w:fill="FFFFFF"/>
+        <w:wordWrap w:val="0"/>
+        <w:textAlignment w:val="baseline"/>
+        <w:rPr>
+          <w:color w:val="000000"/>
+          <w:sz w:val="21"/>
+          <w:szCs w:val="21"/>
+        </w:rPr>
+      </w:pPr>
+      <w:proofErr w:type="gramStart"/>
+      <w:r>
+        <w:t>Cheshire :</w:t>
+      </w:r>
+      <w:proofErr w:type="gramEnd"/>
+      <w:r>
+        <w:rPr>
+          <w:color w:val="000000"/>
+          <w:sz w:val="21"/>
+          <w:szCs w:val="21"/>
+        </w:rPr>
+        <w:t xml:space="preserve"> </w:t>
+      </w:r>
+      <w:r>
+        <w:rPr>
+          <w:color w:val="000000"/>
+          <w:sz w:val="21"/>
+          <w:szCs w:val="21"/>
+        </w:rPr>
+        <w:t>156774</w:t>
+      </w:r>
+    </w:p>
+    <w:p>
+      <w:pPr>
+        <w:pStyle w:val="HTMLPreformatted"/>
+        <w:shd w:val="clear" w:color="auto" w:fill="FFFFFF"/>
+        <w:wordWrap w:val="0"/>
+        <w:textAlignment w:val="baseline"/>
+        <w:rPr>
+          <w:color w:val="000000"/>
+          <w:sz w:val="21"/>
+          <w:szCs w:val="21"/>
+        </w:rPr>
+      </w:pPr>
+      <w:r>
+        <w:t>Kent:</w:t>
+      </w:r>
+      <w:r>
+        <w:rPr>
+          <w:color w:val="000000"/>
+          <w:sz w:val="21"/>
+          <w:szCs w:val="21"/>
+        </w:rPr>
+        <w:t xml:space="preserve"> </w:t>
+      </w:r>
+      <w:r>
+        <w:rPr>
+          <w:color w:val="000000"/>
+          <w:sz w:val="21"/>
+          <w:szCs w:val="21"/>
+        </w:rPr>
+        <w:t>312886</w:t>
+      </w:r>
+    </w:p>
+    <w:p>
+      <w:pPr>
+        <w:pStyle w:val="HTMLPreformatted"/>
+        <w:shd w:val="clear" w:color="auto" w:fill="FFFFFF"/>
+        <w:wordWrap w:val="0"/>
+        <w:textAlignment w:val="baseline"/>
+        <w:rPr>
+          <w:color w:val="000000"/>
+          <w:sz w:val="21"/>
+          <w:szCs w:val="21"/>
+        </w:rPr>
+      </w:pPr>
+      <w:r>
+        <w:t>Lincolnshire:</w:t>
+      </w:r>
+      <w:r>
+        <w:rPr>
+          <w:color w:val="000000"/>
+          <w:sz w:val="21"/>
+          <w:szCs w:val="21"/>
+        </w:rPr>
+        <w:t xml:space="preserve"> </w:t>
+      </w:r>
+      <w:r>
+        <w:rPr>
+          <w:color w:val="000000"/>
+          <w:sz w:val="21"/>
+          <w:szCs w:val="21"/>
+        </w:rPr>
+        <w:t>112665</w:t>
+      </w:r>
+    </w:p>
+    <w:p>
+      <w:pPr>
+        <w:pStyle w:val="HTMLPreformatted"/>
+        <w:shd w:val="clear" w:color="auto" w:fill="FFFFFF"/>
+        <w:wordWrap w:val="0"/>
+        <w:textAlignment w:val="baseline"/>
+        <w:rPr>
+          <w:color w:val="000000"/>
+          <w:sz w:val="21"/>
+          <w:szCs w:val="21"/>
+        </w:rPr>
+      </w:pPr>
+      <w:r>
+        <w:t xml:space="preserve">Sussex: </w:t>
+      </w:r>
+      <w:r>
+        <w:rPr>
+          <w:color w:val="000000"/>
+          <w:sz w:val="21"/>
+          <w:szCs w:val="21"/>
+        </w:rPr>
+        <w:t>258319</w:t>
+      </w:r>
+    </w:p>
+    <w:p/>
+    <w:p>
+      <w:r>
+        <w:t xml:space="preserve">Before cleaning </w:t>
+      </w:r>
+    </w:p>
+    <w:p>
+      <w:pPr>
+        <w:pStyle w:val="HTMLPreformatted"/>
+        <w:shd w:val="clear" w:color="auto" w:fill="FFFFFF"/>
+        <w:wordWrap w:val="0"/>
+        <w:textAlignment w:val="baseline"/>
+        <w:rPr>
+          <w:color w:val="000000"/>
+          <w:sz w:val="21"/>
+          <w:szCs w:val="21"/>
+        </w:rPr>
+      </w:pPr>
+      <w:r>
+        <w:rPr>
+          <w:color w:val="000000"/>
+          <w:sz w:val="21"/>
+          <w:szCs w:val="21"/>
+        </w:rPr>
+        <w:t>172853</w:t>
+      </w:r>
+    </w:p>
+    <w:p>
+      <w:pPr>
+        <w:pStyle w:val="HTMLPreformatted"/>
+        <w:shd w:val="clear" w:color="auto" w:fill="FFFFFF"/>
+        <w:wordWrap w:val="0"/>
+        <w:textAlignment w:val="baseline"/>
+        <w:rPr>
+          <w:color w:val="000000"/>
+          <w:sz w:val="21"/>
+          <w:szCs w:val="21"/>
+        </w:rPr>
+      </w:pPr>
+      <w:r>
+        <w:rPr>
+          <w:color w:val="000000"/>
+          <w:sz w:val="21"/>
+          <w:szCs w:val="21"/>
+        </w:rPr>
+        <w:t>377328</w:t>
+      </w:r>
+    </w:p>
+    <w:p>
+      <w:pPr>
+        <w:pStyle w:val="HTMLPreformatted"/>
+        <w:shd w:val="clear" w:color="auto" w:fill="FFFFFF"/>
+        <w:wordWrap w:val="0"/>
+        <w:textAlignment w:val="baseline"/>
+        <w:rPr>
+          <w:color w:val="000000"/>
+          <w:sz w:val="21"/>
+          <w:szCs w:val="21"/>
+        </w:rPr>
+      </w:pPr>
+      <w:r>
+        <w:rPr>
+          <w:color w:val="000000"/>
+          <w:sz w:val="21"/>
+          <w:szCs w:val="21"/>
+        </w:rPr>
+        <w:t>144284</w:t>
+      </w:r>
+    </w:p>
+    <w:p>
+      <w:pPr>
+        <w:pStyle w:val="HTMLPreformatted"/>
+        <w:shd w:val="clear" w:color="auto" w:fill="FFFFFF"/>
+        <w:wordWrap w:val="0"/>
+        <w:textAlignment w:val="baseline"/>
+        <w:rPr>
+          <w:color w:val="000000"/>
+          <w:sz w:val="21"/>
+          <w:szCs w:val="21"/>
+        </w:rPr>
+      </w:pPr>
+      <w:r>
+        <w:rPr>
+          <w:color w:val="000000"/>
+          <w:sz w:val="21"/>
+          <w:szCs w:val="21"/>
+        </w:rPr>
+        <w:t>321913</w:t>
+      </w:r>
+    </w:p>
+    <w:p/>
+    <w:p/>
+    <w:p>
+      <w:r>
+        <w:t xml:space="preserve">Crime rate </w:t>
+      </w:r>
+    </w:p>
+    <w:p>
+      <w:pPr>
+        <w:pStyle w:val="ListParagraph"/>
+        <w:numPr>
+          <w:ilvl w:val="0"/>
+          <w:numId w:val="1"/>
+        </w:numPr>
+      </w:pPr>
+      <w:r>
+        <w:t xml:space="preserve">Cheshire </w:t>
+      </w:r>
+      <w:r>
+        <w:rPr>
+          <w:color w:val="000000"/>
+          <w:sz w:val="21"/>
+          <w:szCs w:val="21"/>
+        </w:rPr>
+        <w:t>156774</w:t>
+      </w:r>
+      <w:r>
+        <w:rPr>
+          <w:color w:val="000000"/>
+          <w:sz w:val="21"/>
+          <w:szCs w:val="21"/>
+        </w:rPr>
+        <w:t>/</w:t>
+      </w:r>
+      <w:r>
+        <w:t>1</w:t>
+      </w:r>
+      <w:r>
+        <w:t>1</w:t>
+      </w:r>
+      <w:r>
+        <w:t>25434</w:t>
+      </w:r>
+      <w:r>
+        <w:rPr>
+          <w:rFonts w:ascii="Arial" w:hAnsi="Arial" w:cs="Arial"/>
+          <w:color w:val="212529"/>
+          <w:sz w:val="36"/>
+          <w:szCs w:val="36"/>
+          <w:shd w:val="clear" w:color="auto" w:fill="FFFFFF"/>
+        </w:rPr>
+        <w:t xml:space="preserve">= </w:t>
+      </w:r>
+      <w:r>
+        <w:rPr>
+          <w:rFonts w:ascii="Arial" w:hAnsi="Arial" w:cs="Arial"/>
+          <w:color w:val="212529"/>
+          <w:sz w:val="36"/>
+          <w:szCs w:val="36"/>
+          <w:shd w:val="clear" w:color="auto" w:fill="FFFFFF"/>
+        </w:rPr>
+        <w:t>14%</w:t>
+      </w:r>
+    </w:p>
+    <w:p>
+      <w:pPr>
+        <w:pStyle w:val="HTMLPreformatted"/>
+        <w:numPr>
+          <w:ilvl w:val="0"/>
+          <w:numId w:val="1"/>
+        </w:numPr>
+        <w:shd w:val="clear" w:color="auto" w:fill="FFFFFF"/>
+        <w:wordWrap w:val="0"/>
+        <w:textAlignment w:val="baseline"/>
+        <w:rPr>
+          <w:color w:val="000000"/>
+          <w:sz w:val="21"/>
+          <w:szCs w:val="21"/>
+        </w:rPr>
+      </w:pPr>
+      <w:proofErr w:type="gramStart"/>
+      <w:r>
+        <w:t xml:space="preserve">Kent  </w:t>
+      </w:r>
+      <w:r>
+        <w:rPr>
+          <w:color w:val="000000"/>
+          <w:sz w:val="21"/>
+          <w:szCs w:val="21"/>
+        </w:rPr>
+        <w:t>312886</w:t>
+      </w:r>
+      <w:proofErr w:type="gramEnd"/>
+      <w:r>
+        <w:rPr>
+          <w:color w:val="000000"/>
+          <w:sz w:val="21"/>
+          <w:szCs w:val="21"/>
+        </w:rPr>
+        <w:t xml:space="preserve"> / </w:t>
+      </w:r>
+      <w:r>
+        <w:rPr>
+          <w:rFonts w:ascii="Helvetica Neue" w:hAnsi="Helvetica Neue"/>
+          <w:color w:val="303955"/>
+          <w:sz w:val="27"/>
+          <w:szCs w:val="27"/>
+        </w:rPr>
+        <w:t>1,639,000</w:t>
+      </w:r>
+      <w:r>
+        <w:rPr>
+          <w:rFonts w:ascii="Helvetica Neue" w:hAnsi="Helvetica Neue"/>
+          <w:color w:val="303955"/>
+          <w:sz w:val="27"/>
+          <w:szCs w:val="27"/>
+        </w:rPr>
+        <w:t xml:space="preserve"> = </w:t>
+      </w:r>
+      <w:r>
+        <w:rPr>
+          <w:rFonts w:ascii="Helvetica Neue" w:hAnsi="Helvetica Neue"/>
+          <w:color w:val="303955"/>
+          <w:sz w:val="27"/>
+          <w:szCs w:val="27"/>
+        </w:rPr>
+        <w:t>19%</w:t>
+      </w:r>
+    </w:p>
+    <w:p>
+      <w:pPr>
+        <w:pStyle w:val="HTMLPreformatted"/>
+        <w:numPr>
+          <w:ilvl w:val="0"/>
+          <w:numId w:val="1"/>
+        </w:numPr>
+        <w:shd w:val="clear" w:color="auto" w:fill="FFFFFF"/>
+        <w:wordWrap w:val="0"/>
+        <w:textAlignment w:val="baseline"/>
+        <w:rPr>
+          <w:color w:val="000000"/>
+          <w:sz w:val="21"/>
+          <w:szCs w:val="21"/>
+        </w:rPr>
+      </w:pPr>
+      <w:proofErr w:type="gramStart"/>
+      <w:r>
+        <w:lastRenderedPageBreak/>
+        <w:t xml:space="preserve">Lincolnshire  </w:t>
+      </w:r>
+      <w:r>
+        <w:rPr>
+          <w:color w:val="000000"/>
+          <w:sz w:val="21"/>
+          <w:szCs w:val="21"/>
+        </w:rPr>
+        <w:t>112665</w:t>
+      </w:r>
+      <w:proofErr w:type="gramEnd"/>
+      <w:r>
+        <w:rPr>
+          <w:color w:val="000000"/>
+          <w:sz w:val="21"/>
+          <w:szCs w:val="21"/>
+        </w:rPr>
+        <w:t xml:space="preserve">/ </w:t>
+      </w:r>
+      <w:r>
+        <w:rPr>
+          <w:rFonts w:ascii="Menlo" w:hAnsi="Menlo" w:cs="Menlo"/>
+          <w:color w:val="000000"/>
+          <w:sz w:val="27"/>
+          <w:szCs w:val="27"/>
+          <w:shd w:val="clear" w:color="auto" w:fill="EEF2FF"/>
+        </w:rPr>
+        <w:t>769,500</w:t>
+      </w:r>
+      <w:r>
+        <w:rPr>
+          <w:rFonts w:ascii="Menlo" w:hAnsi="Menlo" w:cs="Menlo"/>
+          <w:color w:val="000000"/>
+          <w:sz w:val="27"/>
+          <w:szCs w:val="27"/>
+          <w:shd w:val="clear" w:color="auto" w:fill="EEF2FF"/>
+        </w:rPr>
+        <w:t xml:space="preserve"> = </w:t>
+      </w:r>
+      <w:r>
+        <w:rPr>
+          <w:rFonts w:ascii="Menlo" w:hAnsi="Menlo" w:cs="Menlo"/>
+          <w:color w:val="000000"/>
+          <w:sz w:val="27"/>
+          <w:szCs w:val="27"/>
+          <w:shd w:val="clear" w:color="auto" w:fill="EEF2FF"/>
+        </w:rPr>
+        <w:t>14%</w:t>
+      </w:r>
+    </w:p>
+    <w:p>
+      <w:pPr>
+        <w:pStyle w:val="ListParagraph"/>
+        <w:numPr>
+          <w:ilvl w:val="0"/>
+          <w:numId w:val="2"/>
+        </w:numPr>
+      </w:pPr>
+      <w:proofErr w:type="gramStart"/>
+      <w:r>
+        <w:t xml:space="preserve">Sussex  </w:t>
+      </w:r>
+      <w:r>
+        <w:rPr>
+          <w:color w:val="000000"/>
+          <w:sz w:val="21"/>
+          <w:szCs w:val="21"/>
+        </w:rPr>
+        <w:t>258319</w:t>
+      </w:r>
+      <w:proofErr w:type="gramEnd"/>
+      <w:r>
+        <w:rPr>
+          <w:color w:val="000000"/>
+          <w:sz w:val="21"/>
+          <w:szCs w:val="21"/>
+        </w:rPr>
+        <w:t>/</w:t>
+      </w:r>
+      <w:r>
+        <w:t>1759789</w:t>
+      </w:r>
+      <w:r>
+        <w:t xml:space="preserve"> = </w:t>
+      </w:r>
+      <w:r>
+        <w:t>14%</w:t>
+      </w:r>
+    </w:p>
+    <w:p>
+      <w:pPr>
+        <w:pStyle w:val="HTMLPreformatted"/>
+        <w:numPr>
+          <w:ilvl w:val="0"/>
+          <w:numId w:val="1"/>
+        </w:numPr>
+        <w:shd w:val="clear" w:color="auto" w:fill="FFFFFF"/>
+        <w:wordWrap w:val="0"/>
+        <w:textAlignment w:val="baseline"/>
+        <w:rPr>
+          <w:color w:val="000000"/>
+          <w:sz w:val="21"/>
+          <w:szCs w:val="21"/>
+        </w:rPr>
+      </w:pPr>
+    </w:p>
+    <w:p>
+      <w:r>
+        <w:t xml:space="preserve"> </w:t>
+      </w:r>
+    </w:p>
+    <w:p>
+      <w:r>
+        <w:t xml:space="preserve">Before cleaning </w:t>
+      </w:r>
+    </w:p>
+    <w:p>
+      <w:r>
+        <w:t>Cheshire 15</w:t>
+      </w:r>
+      <w:r>
+        <w:t>%</w:t>
+      </w:r>
+    </w:p>
+    <w:p>
+      <w:r>
+        <w:t xml:space="preserve">Kent </w:t>
+      </w:r>
+      <w:r>
+        <w:t>23%</w:t>
+      </w:r>
+    </w:p>
+    <w:p>
+      <w:r>
+        <w:t xml:space="preserve">Lincolnshire </w:t>
+      </w:r>
+      <w:r>
+        <w:t>18%</w:t>
+      </w:r>
+    </w:p>
+    <w:p>
+      <w:r>
+        <w:t xml:space="preserve">Sussex </w:t>
+      </w:r>
+      <w:r>
+        <w:t xml:space="preserve">18% </w:t>
+      </w:r>
+    </w:p>
+    <w:p/>
+    <w:p>
+      <w:r>
+        <w:t xml:space="preserve">Number of stop and search by region </w:t>
+      </w:r>
+    </w:p>
+    <w:p/>
+    <w:p/>
+    <w:p>
+      <w:pPr>
+        <w:pStyle w:val="ListParagraph"/>
+        <w:numPr>
+          <w:ilvl w:val="0"/>
+          <w:numId w:val="1"/>
+        </w:numPr>
+      </w:pPr>
+      <w:r>
+        <w:t xml:space="preserve">Most common outcome of stop and search by region </w:t>
+      </w:r>
+    </w:p>
+    <w:p>
+      <w:pPr>
+        <w:pStyle w:val="ListParagraph"/>
+        <w:numPr>
+          <w:ilvl w:val="0"/>
+          <w:numId w:val="1"/>
+        </w:numPr>
+      </w:pPr>
+    </w:p>
+    <w:p/>
+    <w:p>
+      <w:pPr>
+        <w:pStyle w:val="ListParagraph"/>
+        <w:numPr>
+          <w:ilvl w:val="0"/>
+          <w:numId w:val="1"/>
+        </w:numPr>
+      </w:pPr>
+      <w:r>
+        <w:t xml:space="preserve">Most common location near supermarket and parking area </w:t>
+      </w:r>
+    </w:p>
+    <w:p>
+      <w:pPr>
+        <w:pStyle w:val="ListParagraph"/>
+        <w:numPr>
+          <w:ilvl w:val="1"/>
+          <w:numId w:val="1"/>
+        </w:numPr>
+      </w:pPr>
+      <w:r>
+        <w:t xml:space="preserve">What is the most common crime type by area </w:t>
+      </w:r>
+    </w:p>
+    <w:p/>
+    <w:p/>
+    <w:p>
+      <w:pPr>
+        <w:pStyle w:val="ListParagraph"/>
+        <w:numPr>
+          <w:ilvl w:val="0"/>
+          <w:numId w:val="1"/>
+        </w:numPr>
+      </w:pPr>
+      <w:r>
+        <w:t xml:space="preserve">Most common type of crime is </w:t>
+      </w:r>
+      <w:proofErr w:type="gramStart"/>
+      <w:r>
+        <w:t>violence  and</w:t>
+      </w:r>
+      <w:proofErr w:type="gramEnd"/>
+      <w:r>
+        <w:t xml:space="preserve"> sexual </w:t>
+      </w:r>
+      <w:proofErr w:type="gramStart"/>
+      <w:r>
+        <w:t>offences</w:t>
+      </w:r>
+      <w:proofErr w:type="gramEnd"/>
+      <w:r>
+        <w:t xml:space="preserve"> and </w:t>
+      </w:r>
+      <w:proofErr w:type="gramStart"/>
+      <w:r>
+        <w:t>shoplifting ,</w:t>
+      </w:r>
+      <w:proofErr w:type="gramEnd"/>
+      <w:r>
+        <w:t xml:space="preserve"> criminal damage and arson is bigger in Kent </w:t>
+      </w:r>
+    </w:p>
+    <w:p/>
+    <w:p>
+      <w:pPr>
+        <w:pStyle w:val="ListParagraph"/>
+        <w:numPr>
+          <w:ilvl w:val="0"/>
+          <w:numId w:val="1"/>
+        </w:numPr>
+      </w:pPr>
+      <w:r>
+        <w:t xml:space="preserve">Most common outcome no suspect identified or unable to prosecute suspect </w:t>
+      </w:r>
+    </w:p>
+    <w:p>
+      <w:pPr>
+        <w:pStyle w:val="ListParagraph"/>
+      </w:pPr>
+    </w:p>
+    <w:p>
+      <w:pPr>
+        <w:pStyle w:val="ListParagraph"/>
+        <w:numPr>
+          <w:ilvl w:val="0"/>
+          <w:numId w:val="1"/>
+        </w:numPr>
+      </w:pPr>
+      <w:r>
+        <w:t>unable to prosecute suspect</w:t>
+      </w:r>
+      <w:r>
+        <w:t xml:space="preserve"> majority violent or sexual crimes then public order </w:t>
+      </w:r>
+    </w:p>
+    <w:p>
+      <w:pPr>
+        <w:pStyle w:val="ListParagraph"/>
+      </w:pPr>
+    </w:p>
+    <w:p>
+      <w:pPr>
+        <w:pStyle w:val="ListParagraph"/>
+        <w:numPr>
+          <w:ilvl w:val="0"/>
+          <w:numId w:val="1"/>
+        </w:numPr>
+      </w:pPr>
+      <w:r>
+        <w:t xml:space="preserve">crime seems to always drop in </w:t>
+      </w:r>
+      <w:proofErr w:type="spellStart"/>
+      <w:r>
+        <w:t>february</w:t>
+      </w:r>
+      <w:proofErr w:type="spellEnd"/>
+      <w:r>
+        <w:t xml:space="preserve"> and </w:t>
+      </w:r>
+      <w:proofErr w:type="gramStart"/>
+      <w:r>
+        <w:t xml:space="preserve">September </w:t>
+      </w:r>
+      <w:r>
+        <w:t xml:space="preserve"> peak</w:t>
+      </w:r>
+      <w:proofErr w:type="gramEnd"/>
+      <w:r>
+        <w:t xml:space="preserve"> in July </w:t>
+      </w:r>
+    </w:p>
+    <w:p>
+      <w:pPr>
+        <w:pStyle w:val="ListParagraph"/>
+      </w:pPr>
+    </w:p>
+    <w:p>
+      <w:pPr>
+        <w:pStyle w:val="ListParagraph"/>
+        <w:numPr>
+          <w:ilvl w:val="0"/>
+          <w:numId w:val="1"/>
+        </w:numPr>
+      </w:pPr>
+      <w:r>
+        <w:t xml:space="preserve">big drop in sexual crimes in </w:t>
+      </w:r>
+      <w:proofErr w:type="spellStart"/>
+      <w:r>
+        <w:t>sep</w:t>
+      </w:r>
+      <w:proofErr w:type="spellEnd"/>
+      <w:r>
+        <w:t xml:space="preserve"> 2025</w:t>
+      </w:r>
+      <w:r>
+        <w:t xml:space="preserve"> </w:t>
+      </w:r>
+    </w:p>
+    <w:p>
+      <w:pPr>
+        <w:pStyle w:val="ListParagraph"/>
+      </w:pPr>
+    </w:p>
+    <w:p>
+      <w:pPr>
+        <w:pStyle w:val="ListParagraph"/>
+        <w:numPr>
+          <w:ilvl w:val="0"/>
+          <w:numId w:val="1"/>
+        </w:numPr>
+      </w:pPr>
+      <w:r>
+        <w:t xml:space="preserve">peak sexual crimes in July 2025 </w:t>
+      </w:r>
+    </w:p>
+    <w:p>
+      <w:pPr>
+        <w:pStyle w:val="ListParagraph"/>
+      </w:pPr>
+    </w:p>
+    <w:p>
+      <w:pPr>
+        <w:pStyle w:val="ListParagraph"/>
+        <w:numPr>
+          <w:ilvl w:val="0"/>
+          <w:numId w:val="1"/>
+        </w:numPr>
+      </w:pPr>
+      <w:r>
+        <w:t xml:space="preserve">big drop in crimes in south in dep 24 but not </w:t>
+      </w:r>
+      <w:proofErr w:type="gramStart"/>
+      <w:r>
+        <w:t>north(</w:t>
+      </w:r>
+      <w:proofErr w:type="gramEnd"/>
+      <w:r>
+        <w:t xml:space="preserve">goes up in </w:t>
+      </w:r>
+      <w:proofErr w:type="spellStart"/>
+      <w:r>
+        <w:t>lincolnhsire</w:t>
+      </w:r>
+      <w:proofErr w:type="spellEnd"/>
+      <w:r>
+        <w:t>)</w:t>
+      </w:r>
+    </w:p>
+    <w:p>
+      <w:pPr>
+        <w:pStyle w:val="ListParagraph"/>
+      </w:pPr>
+    </w:p>
+    <w:p/>
+    <w:p/>
+    <w:p>
+      <w:r>
+        <w:t xml:space="preserve">EDA report structure </w:t>
+      </w:r>
+    </w:p>
+    <w:p/>
+    <w:p>
+      <w:r>
+        <w:t xml:space="preserve">Executive summary </w:t>
+      </w:r>
+    </w:p>
+    <w:p>
+      <w:pPr>
+        <w:pStyle w:val="ListParagraph"/>
+        <w:numPr>
+          <w:ilvl w:val="0"/>
+          <w:numId w:val="1"/>
+        </w:numPr>
+      </w:pPr>
+      <w:r>
+        <w:t>summary of outcome s</w:t>
+      </w:r>
+    </w:p>
+    <w:p>
+      <w:pPr>
+        <w:pStyle w:val="ListParagraph"/>
+        <w:numPr>
+          <w:ilvl w:val="0"/>
+          <w:numId w:val="1"/>
+        </w:numPr>
+      </w:pPr>
+    </w:p>
+    <w:p/>
+    <w:p/>
+    <w:p>
+      <w:r>
+        <w:t xml:space="preserve">methodology </w:t>
+      </w:r>
+    </w:p>
+    <w:p>
+      <w:r>
+        <w:t>Data dictionary</w:t>
+      </w:r>
+    </w:p>
+    <w:p>
+      <w:pPr>
+        <w:pStyle w:val="ListParagraph"/>
+        <w:numPr>
+          <w:ilvl w:val="0"/>
+          <w:numId w:val="1"/>
+        </w:numPr>
+      </w:pPr>
+      <w:r>
+        <w:t xml:space="preserve">explain regions </w:t>
+      </w:r>
+      <w:proofErr w:type="spellStart"/>
+      <w:r>
+        <w:t>eg</w:t>
+      </w:r>
+      <w:proofErr w:type="spellEnd"/>
+      <w:r>
+        <w:t xml:space="preserve"> pop size where they are </w:t>
+      </w:r>
+    </w:p>
+    <w:p>
+      <w:pPr>
+        <w:pStyle w:val="ListParagraph"/>
+        <w:numPr>
+          <w:ilvl w:val="0"/>
+          <w:numId w:val="1"/>
+        </w:numPr>
+      </w:pPr>
+      <w:proofErr w:type="spellStart"/>
+      <w:r>
+        <w:lastRenderedPageBreak/>
+        <w:t>expalin</w:t>
+      </w:r>
+      <w:proofErr w:type="spellEnd"/>
+      <w:r>
+        <w:t xml:space="preserve"> columns in each data set </w:t>
+      </w:r>
+    </w:p>
+    <w:p/>
+    <w:p>
+      <w:r>
+        <w:t>data preprocessing</w:t>
+      </w:r>
+    </w:p>
+    <w:p>
+      <w:pPr>
+        <w:pStyle w:val="ListParagraph"/>
+        <w:numPr>
+          <w:ilvl w:val="0"/>
+          <w:numId w:val="1"/>
+        </w:numPr>
+      </w:pPr>
+      <w:r>
+        <w:t xml:space="preserve">why methods were used </w:t>
+      </w:r>
+    </w:p>
+    <w:p>
+      <w:pPr>
+        <w:pStyle w:val="ListParagraph"/>
+        <w:numPr>
+          <w:ilvl w:val="0"/>
+          <w:numId w:val="1"/>
+        </w:numPr>
+      </w:pPr>
+      <w:r>
+        <w:t xml:space="preserve">workflow </w:t>
+      </w:r>
+    </w:p>
+    <w:p/>
+    <w:p>
+      <w:r>
+        <w:t xml:space="preserve">EDA </w:t>
+      </w:r>
+    </w:p>
+    <w:p>
+      <w:pPr>
+        <w:pStyle w:val="ListParagraph"/>
+        <w:numPr>
+          <w:ilvl w:val="0"/>
+          <w:numId w:val="1"/>
+        </w:numPr>
+      </w:pPr>
+      <w:r>
+        <w:t xml:space="preserve">description of </w:t>
+      </w:r>
+      <w:proofErr w:type="gramStart"/>
+      <w:r>
+        <w:t>regions ?</w:t>
+      </w:r>
+      <w:proofErr w:type="gramEnd"/>
+      <w:r>
+        <w:t xml:space="preserve"> </w:t>
+      </w:r>
+    </w:p>
+    <w:p>
+      <w:pPr>
+        <w:pStyle w:val="ListParagraph"/>
+        <w:numPr>
+          <w:ilvl w:val="0"/>
+          <w:numId w:val="1"/>
+        </w:numPr>
+      </w:pPr>
+      <w:r>
+        <w:t xml:space="preserve">basic graphs </w:t>
+      </w:r>
+      <w:proofErr w:type="spellStart"/>
+      <w:r>
+        <w:t>eg</w:t>
+      </w:r>
+      <w:proofErr w:type="spellEnd"/>
+      <w:r>
+        <w:t xml:space="preserve"> by crime type by area </w:t>
+      </w:r>
+    </w:p>
+    <w:p>
+      <w:pPr>
+        <w:pStyle w:val="ListParagraph"/>
+        <w:numPr>
+          <w:ilvl w:val="0"/>
+          <w:numId w:val="1"/>
+        </w:numPr>
+      </w:pPr>
+      <w:r>
+        <w:t xml:space="preserve">multivariate analysis </w:t>
+      </w:r>
+    </w:p>
+    <w:p>
+      <w:pPr>
+        <w:pStyle w:val="ListParagraph"/>
+        <w:numPr>
+          <w:ilvl w:val="1"/>
+          <w:numId w:val="1"/>
+        </w:numPr>
+      </w:pPr>
+      <w:r>
+        <w:t xml:space="preserve">compare </w:t>
+      </w:r>
+      <w:proofErr w:type="spellStart"/>
+      <w:r>
+        <w:t>variabels</w:t>
+      </w:r>
+      <w:proofErr w:type="spellEnd"/>
+      <w:r>
+        <w:t xml:space="preserve"> against each other </w:t>
+      </w:r>
+    </w:p>
+    <w:p/>
+    <w:p>
+      <w:r>
+        <w:t xml:space="preserve">conclusion </w:t>
+      </w:r>
+    </w:p>
+    <w:p>
+      <w:pPr>
+        <w:pStyle w:val="ListParagraph"/>
+        <w:numPr>
+          <w:ilvl w:val="0"/>
+          <w:numId w:val="1"/>
+        </w:numPr>
+      </w:pPr>
+      <w:r>
+        <w:t xml:space="preserve">what points made mean </w:t>
+      </w:r>
+    </w:p>
+    <w:p>
+      <w:pPr>
+        <w:pStyle w:val="ListParagraph"/>
+        <w:numPr>
+          <w:ilvl w:val="0"/>
+          <w:numId w:val="1"/>
+        </w:numPr>
+      </w:pPr>
+      <w:r>
+        <w:t xml:space="preserve">what areas to examine further </w:t>
+      </w:r>
+    </w:p>
+    <w:p>
+      <w:pPr>
+        <w:pStyle w:val="ListParagraph"/>
+        <w:numPr>
+          <w:ilvl w:val="0"/>
+          <w:numId w:val="1"/>
+        </w:numPr>
+      </w:pPr>
+    </w:p>
     <w:sectPr>
       <w:pgSz w:w="11906" w:h="16838"/>
       <w:pgMar w:top="1440" w:right="1440" w:bottom="1440" w:left="1440" w:header="708" w:footer="708" w:gutter="0"/>
@@ -11,6 +1497,242 @@
     </w:sectPr>
   </w:body>
 </w:document>
+</file>
+
+<file path=word/numbering.xml><?xml version="1.0" encoding="utf-8"?>
+<w:numbering xmlns:wpc="http://schemas.microsoft.com/office/word/2010/wordprocessingCanvas" xmlns:cx="http://schemas.microsoft.com/office/drawing/2014/chartex" xmlns:cx1="http://schemas.microsoft.com/office/drawing/2015/9/8/chartex" xmlns:cx2="http://schemas.microsoft.com/office/drawing/2015/10/21/chartex" xmlns:cx3="http://schemas.microsoft.com/office/drawing/2016/5/9/chartex" xmlns:cx4="http://schemas.microsoft.com/office/drawing/2016/5/10/chartex" xmlns:cx5="http://schemas.microsoft.com/office/drawing/2016/5/11/chartex" xmlns:cx6="http://schemas.microsoft.com/office/drawing/2016/5/12/chartex" xmlns:cx7="http://schemas.microsoft.com/office/drawing/2016/5/13/chartex" xmlns:cx8="http://schemas.microsoft.com/office/drawing/2016/5/14/chartex" xmlns:mc="http://schemas.openxmlformats.org/markup-compatibility/2006" xmlns:aink="http://schemas.microsoft.com/office/drawing/2016/ink" xmlns:am3d="http://schemas.microsoft.com/office/drawing/2017/model3d" xmlns:o="urn:schemas-microsoft-com:office:office" xmlns:oel="http://schemas.microsoft.com/office/2019/extlst" xmlns:r="http://schemas.openxmlformats.org/officeDocument/2006/relationships" xmlns:m="http://schemas.openxmlformats.org/officeDocument/2006/math" xmlns:v="urn:schemas-microsoft-com:vml" xmlns:wp14="http://schemas.microsoft.com/office/word/2010/wordprocessingDrawing" xmlns:wp="http://schemas.openxmlformats.org/drawingml/2006/wordprocessingDrawing" xmlns:w10="urn:schemas-microsoft-com:office:word" xmlns:w="http://schemas.openxmlformats.org/wordprocessingml/2006/main" xmlns:w14="http://schemas.microsoft.com/office/word/2010/wordml" xmlns:w15="http://schemas.microsoft.com/office/word/2012/wordml" xmlns:w16cex="http://schemas.microsoft.com/office/word/2018/wordml/cex" xmlns:w16cid="http://schemas.microsoft.com/office/word/2016/wordml/cid" xmlns:w16="http://schemas.microsoft.com/office/word/2018/wordml" xmlns:w16du="http://schemas.microsoft.com/office/word/2023/wordml/word16du" xmlns:w16sdtdh="http://schemas.microsoft.com/office/word/2020/wordml/sdtdatahash" xmlns:w16sdtfl="http://schemas.microsoft.com/office/word/2024/wordml/sdtformatlock" xmlns:w16se="http://schemas.microsoft.com/office/word/2015/wordml/symex" xmlns:wpg="http://schemas.microsoft.com/office/word/2010/wordprocessingGroup" xmlns:wpi="http://schemas.microsoft.com/office/word/2010/wordprocessingInk" xmlns:wne="http://schemas.microsoft.com/office/word/2006/wordml" xmlns:wps="http://schemas.microsoft.com/office/word/2010/wordprocessingShape" mc:Ignorable="w14 w15 w16se w16cid w16 w16cex w16sdtdh w16sdtfl w16du wp14">
+  <w:abstractNum w:abstractNumId="0" w15:restartNumberingAfterBreak="0">
+    <w:nsid w:val="37032D27"/>
+    <w:multiLevelType w:val="hybridMultilevel"/>
+    <w:tmpl w:val="CF602276"/>
+    <w:lvl w:ilvl="0" w:tplc="73502946">
+      <w:start w:val="6"/>
+      <w:numFmt w:val="bullet"/>
+      <w:lvlText w:val="-"/>
+      <w:lvlJc w:val="left"/>
+      <w:pPr>
+        <w:ind w:left="400" w:hanging="360"/>
+      </w:pPr>
+      <w:rPr>
+        <w:rFonts w:ascii="Aptos" w:eastAsiaTheme="minorHAnsi" w:hAnsi="Aptos" w:cstheme="minorBidi" w:hint="default"/>
+      </w:rPr>
+    </w:lvl>
+    <w:lvl w:ilvl="1" w:tplc="08090003">
+      <w:start w:val="1"/>
+      <w:numFmt w:val="bullet"/>
+      <w:lvlText w:val="o"/>
+      <w:lvlJc w:val="left"/>
+      <w:pPr>
+        <w:ind w:left="1120" w:hanging="360"/>
+      </w:pPr>
+      <w:rPr>
+        <w:rFonts w:ascii="Courier New" w:hAnsi="Courier New" w:cs="Courier New" w:hint="default"/>
+      </w:rPr>
+    </w:lvl>
+    <w:lvl w:ilvl="2" w:tplc="08090005" w:tentative="1">
+      <w:start w:val="1"/>
+      <w:numFmt w:val="bullet"/>
+      <w:lvlText w:val=""/>
+      <w:lvlJc w:val="left"/>
+      <w:pPr>
+        <w:ind w:left="1840" w:hanging="360"/>
+      </w:pPr>
+      <w:rPr>
+        <w:rFonts w:ascii="Wingdings" w:hAnsi="Wingdings" w:hint="default"/>
+      </w:rPr>
+    </w:lvl>
+    <w:lvl w:ilvl="3" w:tplc="08090001" w:tentative="1">
+      <w:start w:val="1"/>
+      <w:numFmt w:val="bullet"/>
+      <w:lvlText w:val=""/>
+      <w:lvlJc w:val="left"/>
+      <w:pPr>
+        <w:ind w:left="2560" w:hanging="360"/>
+      </w:pPr>
+      <w:rPr>
+        <w:rFonts w:ascii="Symbol" w:hAnsi="Symbol" w:hint="default"/>
+      </w:rPr>
+    </w:lvl>
+    <w:lvl w:ilvl="4" w:tplc="08090003" w:tentative="1">
+      <w:start w:val="1"/>
+      <w:numFmt w:val="bullet"/>
+      <w:lvlText w:val="o"/>
+      <w:lvlJc w:val="left"/>
+      <w:pPr>
+        <w:ind w:left="3280" w:hanging="360"/>
+      </w:pPr>
+      <w:rPr>
+        <w:rFonts w:ascii="Courier New" w:hAnsi="Courier New" w:cs="Courier New" w:hint="default"/>
+      </w:rPr>
+    </w:lvl>
+    <w:lvl w:ilvl="5" w:tplc="08090005" w:tentative="1">
+      <w:start w:val="1"/>
+      <w:numFmt w:val="bullet"/>
+      <w:lvlText w:val=""/>
+      <w:lvlJc w:val="left"/>
+      <w:pPr>
+        <w:ind w:left="4000" w:hanging="360"/>
+      </w:pPr>
+      <w:rPr>
+        <w:rFonts w:ascii="Wingdings" w:hAnsi="Wingdings" w:hint="default"/>
+      </w:rPr>
+    </w:lvl>
+    <w:lvl w:ilvl="6" w:tplc="08090001" w:tentative="1">
+      <w:start w:val="1"/>
+      <w:numFmt w:val="bullet"/>
+      <w:lvlText w:val=""/>
+      <w:lvlJc w:val="left"/>
+      <w:pPr>
+        <w:ind w:left="4720" w:hanging="360"/>
+      </w:pPr>
+      <w:rPr>
+        <w:rFonts w:ascii="Symbol" w:hAnsi="Symbol" w:hint="default"/>
+      </w:rPr>
+    </w:lvl>
+    <w:lvl w:ilvl="7" w:tplc="08090003" w:tentative="1">
+      <w:start w:val="1"/>
+      <w:numFmt w:val="bullet"/>
+      <w:lvlText w:val="o"/>
+      <w:lvlJc w:val="left"/>
+      <w:pPr>
+        <w:ind w:left="5440" w:hanging="360"/>
+      </w:pPr>
+      <w:rPr>
+        <w:rFonts w:ascii="Courier New" w:hAnsi="Courier New" w:cs="Courier New" w:hint="default"/>
+      </w:rPr>
+    </w:lvl>
+    <w:lvl w:ilvl="8" w:tplc="08090005" w:tentative="1">
+      <w:start w:val="1"/>
+      <w:numFmt w:val="bullet"/>
+      <w:lvlText w:val=""/>
+      <w:lvlJc w:val="left"/>
+      <w:pPr>
+        <w:ind w:left="6160" w:hanging="360"/>
+      </w:pPr>
+      <w:rPr>
+        <w:rFonts w:ascii="Wingdings" w:hAnsi="Wingdings" w:hint="default"/>
+      </w:rPr>
+    </w:lvl>
+  </w:abstractNum>
+  <w:abstractNum w:abstractNumId="1" w15:restartNumberingAfterBreak="0">
+    <w:nsid w:val="53053CA0"/>
+    <w:multiLevelType w:val="hybridMultilevel"/>
+    <w:tmpl w:val="AB20800A"/>
+    <w:lvl w:ilvl="0" w:tplc="58A0733E">
+      <w:numFmt w:val="bullet"/>
+      <w:lvlText w:val="-"/>
+      <w:lvlJc w:val="left"/>
+      <w:pPr>
+        <w:ind w:left="720" w:hanging="360"/>
+      </w:pPr>
+      <w:rPr>
+        <w:rFonts w:ascii="Aptos" w:eastAsiaTheme="minorHAnsi" w:hAnsi="Aptos" w:cstheme="minorBidi" w:hint="default"/>
+      </w:rPr>
+    </w:lvl>
+    <w:lvl w:ilvl="1" w:tplc="08090003" w:tentative="1">
+      <w:start w:val="1"/>
+      <w:numFmt w:val="bullet"/>
+      <w:lvlText w:val="o"/>
+      <w:lvlJc w:val="left"/>
+      <w:pPr>
+        <w:ind w:left="1440" w:hanging="360"/>
+      </w:pPr>
+      <w:rPr>
+        <w:rFonts w:ascii="Courier New" w:hAnsi="Courier New" w:cs="Courier New" w:hint="default"/>
+      </w:rPr>
+    </w:lvl>
+    <w:lvl w:ilvl="2" w:tplc="08090005" w:tentative="1">
+      <w:start w:val="1"/>
+      <w:numFmt w:val="bullet"/>
+      <w:lvlText w:val=""/>
+      <w:lvlJc w:val="left"/>
+      <w:pPr>
+        <w:ind w:left="2160" w:hanging="360"/>
+      </w:pPr>
+      <w:rPr>
+        <w:rFonts w:ascii="Wingdings" w:hAnsi="Wingdings" w:hint="default"/>
+      </w:rPr>
+    </w:lvl>
+    <w:lvl w:ilvl="3" w:tplc="08090001" w:tentative="1">
+      <w:start w:val="1"/>
+      <w:numFmt w:val="bullet"/>
+      <w:lvlText w:val=""/>
+      <w:lvlJc w:val="left"/>
+      <w:pPr>
+        <w:ind w:left="2880" w:hanging="360"/>
+      </w:pPr>
+      <w:rPr>
+        <w:rFonts w:ascii="Symbol" w:hAnsi="Symbol" w:hint="default"/>
+      </w:rPr>
+    </w:lvl>
+    <w:lvl w:ilvl="4" w:tplc="08090003" w:tentative="1">
+      <w:start w:val="1"/>
+      <w:numFmt w:val="bullet"/>
+      <w:lvlText w:val="o"/>
+      <w:lvlJc w:val="left"/>
+      <w:pPr>
+        <w:ind w:left="3600" w:hanging="360"/>
+      </w:pPr>
+      <w:rPr>
+        <w:rFonts w:ascii="Courier New" w:hAnsi="Courier New" w:cs="Courier New" w:hint="default"/>
+      </w:rPr>
+    </w:lvl>
+    <w:lvl w:ilvl="5" w:tplc="08090005" w:tentative="1">
+      <w:start w:val="1"/>
+      <w:numFmt w:val="bullet"/>
+      <w:lvlText w:val=""/>
+      <w:lvlJc w:val="left"/>
+      <w:pPr>
+        <w:ind w:left="4320" w:hanging="360"/>
+      </w:pPr>
+      <w:rPr>
+        <w:rFonts w:ascii="Wingdings" w:hAnsi="Wingdings" w:hint="default"/>
+      </w:rPr>
+    </w:lvl>
+    <w:lvl w:ilvl="6" w:tplc="08090001" w:tentative="1">
+      <w:start w:val="1"/>
+      <w:numFmt w:val="bullet"/>
+      <w:lvlText w:val=""/>
+      <w:lvlJc w:val="left"/>
+      <w:pPr>
+        <w:ind w:left="5040" w:hanging="360"/>
+      </w:pPr>
+      <w:rPr>
+        <w:rFonts w:ascii="Symbol" w:hAnsi="Symbol" w:hint="default"/>
+      </w:rPr>
+    </w:lvl>
+    <w:lvl w:ilvl="7" w:tplc="08090003" w:tentative="1">
+      <w:start w:val="1"/>
+      <w:numFmt w:val="bullet"/>
+      <w:lvlText w:val="o"/>
+      <w:lvlJc w:val="left"/>
+      <w:pPr>
+        <w:ind w:left="5760" w:hanging="360"/>
+      </w:pPr>
+      <w:rPr>
+        <w:rFonts w:ascii="Courier New" w:hAnsi="Courier New" w:cs="Courier New" w:hint="default"/>
+      </w:rPr>
+    </w:lvl>
+    <w:lvl w:ilvl="8" w:tplc="08090005" w:tentative="1">
+      <w:start w:val="1"/>
+      <w:numFmt w:val="bullet"/>
+      <w:lvlText w:val=""/>
+      <w:lvlJc w:val="left"/>
+      <w:pPr>
+        <w:ind w:left="6480" w:hanging="360"/>
+      </w:pPr>
+      <w:rPr>
+        <w:rFonts w:ascii="Wingdings" w:hAnsi="Wingdings" w:hint="default"/>
+      </w:rPr>
+    </w:lvl>
+  </w:abstractNum>
+  <w:num w:numId="1" w16cid:durableId="518814839">
+    <w:abstractNumId w:val="0"/>
+  </w:num>
+  <w:num w:numId="2" w16cid:durableId="1844321305">
+    <w:abstractNumId w:val="1"/>
+  </w:num>
+</w:numbering>
 </file>
 
 <file path=word/styles.xml><?xml version="1.0" encoding="utf-8"?>
@@ -925,6 +2647,68 @@
       <w:spacing w:val="5"/>
     </w:rPr>
   </w:style>
+  <w:style w:type="character" w:styleId="Strong">
+    <w:name w:val="Strong"/>
+    <w:basedOn w:val="DefaultParagraphFont"/>
+    <w:uiPriority w:val="22"/>
+    <w:qFormat/>
+    <w:rsid w:val="004B6A6C"/>
+    <w:rPr>
+      <w:b/>
+      <w:bCs/>
+    </w:rPr>
+  </w:style>
+  <w:style w:type="paragraph" w:styleId="HTMLPreformatted">
+    <w:name w:val="HTML Preformatted"/>
+    <w:basedOn w:val="Normal"/>
+    <w:link w:val="HTMLPreformattedChar"/>
+    <w:uiPriority w:val="99"/>
+    <w:unhideWhenUsed/>
+    <w:rsid w:val="004B6A6C"/>
+    <w:pPr>
+      <w:tabs>
+        <w:tab w:val="left" w:pos="916"/>
+        <w:tab w:val="left" w:pos="1832"/>
+        <w:tab w:val="left" w:pos="2748"/>
+        <w:tab w:val="left" w:pos="3664"/>
+        <w:tab w:val="left" w:pos="4580"/>
+        <w:tab w:val="left" w:pos="5496"/>
+        <w:tab w:val="left" w:pos="6412"/>
+        <w:tab w:val="left" w:pos="7328"/>
+        <w:tab w:val="left" w:pos="8244"/>
+        <w:tab w:val="left" w:pos="9160"/>
+        <w:tab w:val="left" w:pos="10076"/>
+        <w:tab w:val="left" w:pos="10992"/>
+        <w:tab w:val="left" w:pos="11908"/>
+        <w:tab w:val="left" w:pos="12824"/>
+        <w:tab w:val="left" w:pos="13740"/>
+        <w:tab w:val="left" w:pos="14656"/>
+      </w:tabs>
+    </w:pPr>
+    <w:rPr>
+      <w:rFonts w:ascii="Courier New" w:eastAsia="Times New Roman" w:hAnsi="Courier New" w:cs="Courier New"/>
+      <w:kern w:val="0"/>
+      <w:sz w:val="20"/>
+      <w:szCs w:val="20"/>
+      <w:lang w:eastAsia="en-GB"/>
+      <w14:ligatures w14:val="none"/>
+    </w:rPr>
+  </w:style>
+  <w:style w:type="character" w:customStyle="1" w:styleId="HTMLPreformattedChar">
+    <w:name w:val="HTML Preformatted Char"/>
+    <w:basedOn w:val="DefaultParagraphFont"/>
+    <w:link w:val="HTMLPreformatted"/>
+    <w:uiPriority w:val="99"/>
+    <w:rsid w:val="004B6A6C"/>
+    <w:rPr>
+      <w:rFonts w:ascii="Courier New" w:eastAsia="Times New Roman" w:hAnsi="Courier New" w:cs="Courier New"/>
+      <w:kern w:val="0"/>
+      <w:sz w:val="20"/>
+      <w:szCs w:val="20"/>
+      <w:lang w:eastAsia="en-GB"/>
+      <w14:ligatures w14:val="none"/>
+    </w:rPr>
+  </w:style>
 </w:styles>
 </file>
 

</xml_diff>